<commit_message>
Proxy server + Settings
- The gameplay UI is now following the CodeForces format.
- Add five different themes for the Code Editor, allowing theme customisation.
- A static skeleton of Settings UI
- Add code for a proxy server using Express.js
</commit_message>
<xml_diff>
--- a/Software Requirements Specification.docx
+++ b/Software Requirements Specification.docx
@@ -5880,7 +5880,21 @@
           <w:sz w:val="24"/>
           <w:szCs w:val="24"/>
         </w:rPr>
-        <w:t>: Choose the theme for the user’s programming environment’s background.</w:t>
+        <w:t xml:space="preserve">: Choose the theme for the user’s </w:t>
+      </w:r>
+      <w:r>
+        <w:rPr>
+          <w:sz w:val="24"/>
+          <w:szCs w:val="24"/>
+        </w:rPr>
+        <w:t>code editor</w:t>
+      </w:r>
+      <w:r>
+        <w:rPr>
+          <w:sz w:val="24"/>
+          <w:szCs w:val="24"/>
+        </w:rPr>
+        <w:t xml:space="preserve"> background.</w:t>
       </w:r>
     </w:p>
     <w:p>
@@ -5931,14 +5945,42 @@
           <w:sz w:val="24"/>
           <w:szCs w:val="24"/>
         </w:rPr>
-        <w:t>Customise Configuration Script</w:t>
-      </w:r>
-      <w:r>
-        <w:rPr>
-          <w:sz w:val="24"/>
-          <w:szCs w:val="24"/>
-        </w:rPr>
-        <w:t xml:space="preserve">: The user can write the configuration script to better edit texts in the programming environment. </w:t>
+        <w:t>Disable Mouse</w:t>
+      </w:r>
+      <w:r>
+        <w:rPr>
+          <w:sz w:val="24"/>
+          <w:szCs w:val="24"/>
+        </w:rPr>
+        <w:t>: When in matches, the cursor will disappear</w:t>
+      </w:r>
+      <w:r>
+        <w:rPr>
+          <w:sz w:val="24"/>
+          <w:szCs w:val="24"/>
+        </w:rPr>
+        <w:t xml:space="preserve"> in the text editing region</w:t>
+      </w:r>
+      <w:r>
+        <w:rPr>
+          <w:sz w:val="24"/>
+          <w:szCs w:val="24"/>
+        </w:rPr>
+        <w:t xml:space="preserve">. </w:t>
+      </w:r>
+      <w:r>
+        <w:rPr>
+          <w:sz w:val="24"/>
+          <w:szCs w:val="24"/>
+        </w:rPr>
+        <w:t>If this is chosen, Keyboard Mode is automatically enabled and cannot be disabled</w:t>
+      </w:r>
+      <w:r>
+        <w:rPr>
+          <w:sz w:val="24"/>
+          <w:szCs w:val="24"/>
+        </w:rPr>
+        <w:t>.</w:t>
       </w:r>
     </w:p>
     <w:p>
@@ -5960,63 +6002,6 @@
           <w:sz w:val="24"/>
           <w:szCs w:val="24"/>
         </w:rPr>
-        <w:t>Disable Mouse</w:t>
-      </w:r>
-      <w:r>
-        <w:rPr>
-          <w:sz w:val="24"/>
-          <w:szCs w:val="24"/>
-        </w:rPr>
-        <w:t>: When in matches, the cursor will disappear</w:t>
-      </w:r>
-      <w:r>
-        <w:rPr>
-          <w:sz w:val="24"/>
-          <w:szCs w:val="24"/>
-        </w:rPr>
-        <w:t xml:space="preserve"> in the text editing region</w:t>
-      </w:r>
-      <w:r>
-        <w:rPr>
-          <w:sz w:val="24"/>
-          <w:szCs w:val="24"/>
-        </w:rPr>
-        <w:t xml:space="preserve">. </w:t>
-      </w:r>
-      <w:r>
-        <w:rPr>
-          <w:sz w:val="24"/>
-          <w:szCs w:val="24"/>
-        </w:rPr>
-        <w:t>If this is chosen, Keyboard Mode is automatically enabled and cannot be disabled</w:t>
-      </w:r>
-      <w:r>
-        <w:rPr>
-          <w:sz w:val="24"/>
-          <w:szCs w:val="24"/>
-        </w:rPr>
-        <w:t>.</w:t>
-      </w:r>
-    </w:p>
-    <w:p>
-      <w:pPr>
-        <w:numPr>
-          <w:ilvl w:val="0"/>
-          <w:numId w:val="11"/>
-        </w:numPr>
-        <w:shd w:val="clear" w:color="auto" w:fill="FFFFFF"/>
-        <w:spacing w:line="360" w:lineRule="auto"/>
-        <w:rPr>
-          <w:sz w:val="24"/>
-          <w:szCs w:val="24"/>
-        </w:rPr>
-      </w:pPr>
-      <w:r>
-        <w:rPr>
-          <w:b/>
-          <w:sz w:val="24"/>
-          <w:szCs w:val="24"/>
-        </w:rPr>
         <w:t>Enable Keyboard Mode</w:t>
       </w:r>
       <w:r>
@@ -6070,122 +6055,6 @@
           <w:numId w:val="14"/>
         </w:numPr>
         <w:shd w:val="clear" w:color="auto" w:fill="FFFFFF"/>
-        <w:spacing w:line="360" w:lineRule="auto"/>
-        <w:rPr>
-          <w:sz w:val="24"/>
-          <w:szCs w:val="24"/>
-        </w:rPr>
-      </w:pPr>
-      <w:r>
-        <w:rPr>
-          <w:b/>
-          <w:sz w:val="24"/>
-          <w:szCs w:val="24"/>
-        </w:rPr>
-        <w:t>Add programming languages</w:t>
-      </w:r>
-      <w:r>
-        <w:rPr>
-          <w:sz w:val="24"/>
-          <w:szCs w:val="24"/>
-        </w:rPr>
-        <w:t>: Add a new programming language that the user can switch between in the Programming Languages interface. Prompt set compiler, set interpreter or set SDK depending on language.</w:t>
-      </w:r>
-    </w:p>
-    <w:p>
-      <w:pPr>
-        <w:numPr>
-          <w:ilvl w:val="0"/>
-          <w:numId w:val="14"/>
-        </w:numPr>
-        <w:shd w:val="clear" w:color="auto" w:fill="FFFFFF"/>
-        <w:spacing w:line="360" w:lineRule="auto"/>
-        <w:rPr>
-          <w:sz w:val="24"/>
-          <w:szCs w:val="24"/>
-        </w:rPr>
-      </w:pPr>
-      <w:r>
-        <w:rPr>
-          <w:b/>
-          <w:sz w:val="24"/>
-          <w:szCs w:val="24"/>
-        </w:rPr>
-        <w:t>Remove programming language</w:t>
-      </w:r>
-      <w:r>
-        <w:rPr>
-          <w:sz w:val="24"/>
-          <w:szCs w:val="24"/>
-        </w:rPr>
-        <w:t>: Delete the specified programming language from the list of added languages. Automatically remove the associated compiler, interpreter or SDK.</w:t>
-      </w:r>
-    </w:p>
-    <w:p>
-      <w:pPr>
-        <w:numPr>
-          <w:ilvl w:val="0"/>
-          <w:numId w:val="14"/>
-        </w:numPr>
-        <w:shd w:val="clear" w:color="auto" w:fill="FFFFFF"/>
-        <w:spacing w:line="360" w:lineRule="auto"/>
-        <w:rPr>
-          <w:sz w:val="24"/>
-          <w:szCs w:val="24"/>
-        </w:rPr>
-      </w:pPr>
-      <w:r>
-        <w:rPr>
-          <w:b/>
-          <w:sz w:val="24"/>
-          <w:szCs w:val="24"/>
-        </w:rPr>
-        <w:t>Set compiler</w:t>
-      </w:r>
-      <w:r>
-        <w:rPr>
-          <w:sz w:val="24"/>
-          <w:szCs w:val="24"/>
-        </w:rPr>
-        <w:t>: Set the compiler for compiled languages.</w:t>
-      </w:r>
-    </w:p>
-    <w:p>
-      <w:pPr>
-        <w:numPr>
-          <w:ilvl w:val="0"/>
-          <w:numId w:val="14"/>
-        </w:numPr>
-        <w:shd w:val="clear" w:color="auto" w:fill="FFFFFF"/>
-        <w:spacing w:line="360" w:lineRule="auto"/>
-        <w:rPr>
-          <w:sz w:val="24"/>
-          <w:szCs w:val="24"/>
-        </w:rPr>
-      </w:pPr>
-      <w:r>
-        <w:rPr>
-          <w:b/>
-          <w:sz w:val="24"/>
-          <w:szCs w:val="24"/>
-        </w:rPr>
-        <w:t>Set interpreter</w:t>
-      </w:r>
-      <w:r>
-        <w:rPr>
-          <w:sz w:val="24"/>
-          <w:szCs w:val="24"/>
-        </w:rPr>
-        <w:t>: Set the interpreter for interpreted languages.</w:t>
-      </w:r>
-    </w:p>
-    <w:p>
-      <w:pPr>
-        <w:numPr>
-          <w:ilvl w:val="0"/>
-          <w:numId w:val="14"/>
-        </w:numPr>
-        <w:shd w:val="clear" w:color="auto" w:fill="FFFFFF"/>
         <w:spacing w:after="240" w:line="360" w:lineRule="auto"/>
         <w:rPr>
           <w:sz w:val="24"/>
@@ -6198,14 +6067,15 @@
           <w:sz w:val="24"/>
           <w:szCs w:val="24"/>
         </w:rPr>
-        <w:t>Set programming languages</w:t>
-      </w:r>
-      <w:r>
-        <w:rPr>
-          <w:sz w:val="24"/>
-          <w:szCs w:val="24"/>
-        </w:rPr>
-        <w:t>: Set the default programming language for multiplayer and practice matches.</w:t>
+        <w:t>Select Programming Language</w:t>
+      </w:r>
+      <w:r>
+        <w:rPr>
+          <w:bCs/>
+          <w:sz w:val="24"/>
+          <w:szCs w:val="24"/>
+        </w:rPr>
+        <w:t>: Choose the desired programming language for use.</w:t>
       </w:r>
     </w:p>
     <w:p>
@@ -6228,7 +6098,6 @@
           <w:sz w:val="24"/>
           <w:szCs w:val="24"/>
         </w:rPr>
-        <w:lastRenderedPageBreak/>
         <w:t>Report</w:t>
       </w:r>
       <w:r>
@@ -8780,23 +8649,7 @@
           <w:sz w:val="24"/>
           <w:szCs w:val="24"/>
         </w:rPr>
-        <w:t xml:space="preserve"> The player report </w:t>
-      </w:r>
-      <w:proofErr w:type="gramStart"/>
-      <w:r>
-        <w:rPr>
-          <w:sz w:val="24"/>
-          <w:szCs w:val="24"/>
-        </w:rPr>
-        <w:t>handling</w:t>
-      </w:r>
-      <w:proofErr w:type="gramEnd"/>
-      <w:r>
-        <w:rPr>
-          <w:sz w:val="24"/>
-          <w:szCs w:val="24"/>
-        </w:rPr>
-        <w:t xml:space="preserve"> and anti-cheat logic will be discussed in the development phase.</w:t>
+        <w:t xml:space="preserve"> The player report handling and anti-cheat logic will be discussed in the development phase.</w:t>
       </w:r>
     </w:p>
     <w:p>
@@ -9356,6 +9209,102 @@
         <w:shd w:val="clear" w:color="auto" w:fill="FFFFFF"/>
         <w:spacing w:after="240" w:line="360" w:lineRule="auto"/>
         <w:rPr>
+          <w:color w:val="1F2328"/>
+          <w:sz w:val="24"/>
+          <w:szCs w:val="24"/>
+          <w:shd w:val="clear" w:color="auto" w:fill="FFFFFF"/>
+        </w:rPr>
+      </w:pPr>
+    </w:p>
+    <w:p>
+      <w:pPr>
+        <w:shd w:val="clear" w:color="auto" w:fill="FFFFFF"/>
+        <w:spacing w:after="240" w:line="360" w:lineRule="auto"/>
+        <w:rPr>
+          <w:color w:val="1F2328"/>
+          <w:sz w:val="24"/>
+          <w:szCs w:val="24"/>
+          <w:shd w:val="clear" w:color="auto" w:fill="FFFFFF"/>
+        </w:rPr>
+      </w:pPr>
+      <w:r>
+        <w:rPr>
+          <w:color w:val="1F2328"/>
+          <w:sz w:val="24"/>
+          <w:szCs w:val="24"/>
+          <w:shd w:val="clear" w:color="auto" w:fill="FFFFFF"/>
+        </w:rPr>
+        <w:t>User Interface and Frontend will be implemented using the React framework of JS.</w:t>
+      </w:r>
+    </w:p>
+    <w:p>
+      <w:pPr>
+        <w:shd w:val="clear" w:color="auto" w:fill="FFFFFF"/>
+        <w:spacing w:after="240" w:line="360" w:lineRule="auto"/>
+        <w:rPr>
+          <w:color w:val="1F2328"/>
+          <w:sz w:val="24"/>
+          <w:szCs w:val="24"/>
+          <w:shd w:val="clear" w:color="auto" w:fill="FFFFFF"/>
+        </w:rPr>
+      </w:pPr>
+      <w:r>
+        <w:rPr>
+          <w:color w:val="1F2328"/>
+          <w:sz w:val="24"/>
+          <w:szCs w:val="24"/>
+          <w:shd w:val="clear" w:color="auto" w:fill="FFFFFF"/>
+        </w:rPr>
+        <w:t xml:space="preserve">Backend will use Express.js framework of Node.js. Submissions of code will be handled by Judge0 CE API, code execution will be handled by either </w:t>
+      </w:r>
+      <w:proofErr w:type="spellStart"/>
+      <w:r>
+        <w:rPr>
+          <w:color w:val="1F2328"/>
+          <w:sz w:val="24"/>
+          <w:szCs w:val="24"/>
+          <w:shd w:val="clear" w:color="auto" w:fill="FFFFFF"/>
+        </w:rPr>
+        <w:t>PistonAPI</w:t>
+      </w:r>
+      <w:proofErr w:type="spellEnd"/>
+      <w:r>
+        <w:rPr>
+          <w:color w:val="1F2328"/>
+          <w:sz w:val="24"/>
+          <w:szCs w:val="24"/>
+          <w:shd w:val="clear" w:color="auto" w:fill="FFFFFF"/>
+        </w:rPr>
+        <w:t xml:space="preserve"> or Judge0 CE API.</w:t>
+      </w:r>
+    </w:p>
+    <w:p>
+      <w:pPr>
+        <w:shd w:val="clear" w:color="auto" w:fill="FFFFFF"/>
+        <w:spacing w:after="240" w:line="360" w:lineRule="auto"/>
+        <w:rPr>
+          <w:color w:val="1F2328"/>
+          <w:sz w:val="24"/>
+          <w:szCs w:val="24"/>
+          <w:shd w:val="clear" w:color="auto" w:fill="FFFFFF"/>
+        </w:rPr>
+      </w:pPr>
+      <w:r>
+        <w:rPr>
+          <w:color w:val="1F2328"/>
+          <w:sz w:val="24"/>
+          <w:szCs w:val="24"/>
+          <w:shd w:val="clear" w:color="auto" w:fill="FFFFFF"/>
+        </w:rPr>
+        <w:lastRenderedPageBreak/>
+        <w:t xml:space="preserve">Database management system will be PostgreSQL. </w:t>
+      </w:r>
+    </w:p>
+    <w:p>
+      <w:pPr>
+        <w:shd w:val="clear" w:color="auto" w:fill="FFFFFF"/>
+        <w:spacing w:after="240" w:line="360" w:lineRule="auto"/>
+        <w:rPr>
           <w:b/>
           <w:sz w:val="24"/>
           <w:szCs w:val="24"/>
@@ -21351,31 +21300,7 @@
           <w:sz w:val="24"/>
           <w:szCs w:val="24"/>
         </w:rPr>
-        <w:t xml:space="preserve"> </w:t>
-      </w:r>
-      <w:r>
-        <w:rPr>
-          <w:b/>
-          <w:sz w:val="24"/>
-          <w:szCs w:val="24"/>
-        </w:rPr>
-        <w:t>(UC-GAMEPLAY-1</w:t>
-      </w:r>
-      <w:r>
-        <w:rPr>
-          <w:b/>
-          <w:sz w:val="24"/>
-          <w:szCs w:val="24"/>
-        </w:rPr>
-        <w:t>5</w:t>
-      </w:r>
-      <w:r>
-        <w:rPr>
-          <w:b/>
-          <w:sz w:val="24"/>
-          <w:szCs w:val="24"/>
-        </w:rPr>
-        <w:t>)</w:t>
+        <w:t xml:space="preserve"> (UC-GAMEPLAY-15)</w:t>
       </w:r>
     </w:p>
     <w:p>
@@ -21732,23 +21657,7 @@
           <w:sz w:val="24"/>
           <w:szCs w:val="24"/>
         </w:rPr>
-        <w:t>(UC-GAMEPLAY-1</w:t>
-      </w:r>
-      <w:r>
-        <w:rPr>
-          <w:b/>
-          <w:sz w:val="24"/>
-          <w:szCs w:val="24"/>
-        </w:rPr>
-        <w:t>6</w:t>
-      </w:r>
-      <w:r>
-        <w:rPr>
-          <w:b/>
-          <w:sz w:val="24"/>
-          <w:szCs w:val="24"/>
-        </w:rPr>
-        <w:t>)</w:t>
+        <w:t>(UC-GAMEPLAY-16)</w:t>
       </w:r>
     </w:p>
     <w:p>

</xml_diff>